<commit_message>
Add presenter's guide; update review paper to v0.6 (gap v8, dataset section)
Co-Authored-By: Claude Opus 5.5 <noreply@anthropic.com>
Claude-Session: https://claude.ai/code/session_018dosMa47TqmWCCUSzcEhmw
</commit_message>
<xml_diff>
--- a/docs/research_archive/review_paper/REVIEW_PAPER_DRAFT.docx
+++ b/docs/research_archive/review_paper/REVIEW_PAPER_DRAFT.docx
@@ -203,13 +203,13 @@
         <w:t xml:space="preserve"> </w:t>
       </w:r>
       <w:r>
-        <w:t xml:space="preserve">v0.5,</w:t>
-      </w:r>
-      <w:r>
-        <w:t xml:space="preserve"> </w:t>
-      </w:r>
-      <w:r>
-        <w:t xml:space="preserve">15</w:t>
+        <w:t xml:space="preserve">v0.6,</w:t>
+      </w:r>
+      <w:r>
+        <w:t xml:space="preserve"> </w:t>
+      </w:r>
+      <w:r>
+        <w:t xml:space="preserve">17</w:t>
       </w:r>
       <w:r>
         <w:t xml:space="preserve"> </w:t>
@@ -227,25 +227,61 @@
         <w:t xml:space="preserve"> </w:t>
       </w:r>
       <w:r>
-        <w:t xml:space="preserve">(Mohan,</w:t>
-      </w:r>
-      <w:r>
-        <w:t xml:space="preserve"> </w:t>
-      </w:r>
-      <w:r>
-        <w:t xml:space="preserve">Forecast-Dojo,</w:t>
-      </w:r>
-      <w:r>
-        <w:t xml:space="preserve"> </w:t>
-      </w:r>
-      <w:r>
-        <w:t xml:space="preserve">BLF,</w:t>
-      </w:r>
-      <w:r>
-        <w:t xml:space="preserve"> </w:t>
-      </w:r>
-      <w:r>
-        <w:t xml:space="preserve">Kalamara</w:t>
+        <w:t xml:space="preserve">(LiveMacroEval</w:t>
+      </w:r>
+      <w:r>
+        <w:t xml:space="preserve"> </w:t>
+      </w:r>
+      <w:r>
+        <w:t xml:space="preserve">and</w:t>
+      </w:r>
+      <w:r>
+        <w:t xml:space="preserve"> </w:t>
+      </w:r>
+      <w:r>
+        <w:t xml:space="preserve">LLM-CPI</w:t>
+      </w:r>
+      <w:r>
+        <w:t xml:space="preserve"> </w:t>
+      </w:r>
+      <w:r>
+        <w:t xml:space="preserve">read;</w:t>
+      </w:r>
+      <w:r>
+        <w:t xml:space="preserve"> </w:t>
+      </w:r>
+      <w:r>
+        <w:t xml:space="preserve">gap</w:t>
+      </w:r>
+      <w:r>
+        <w:t xml:space="preserve"> </w:t>
+      </w:r>
+      <w:r>
+        <w:t xml:space="preserve">narrowed</w:t>
+      </w:r>
+      <w:r>
+        <w:t xml:space="preserve"> </w:t>
+      </w:r>
+      <w:r>
+        <w:t xml:space="preserve">to</w:t>
+      </w:r>
+      <w:r>
+        <w:t xml:space="preserve"> </w:t>
+      </w:r>
+      <w:r>
+        <w:t xml:space="preserve">v8;</w:t>
+      </w:r>
+      <w:r>
+        <w:t xml:space="preserve"> </w:t>
+      </w:r>
+      <w:r>
+        <w:t xml:space="preserve">dataset</w:t>
+      </w:r>
+      <w:r>
+        <w:t xml:space="preserve"> </w:t>
+      </w:r>
+      <w:r>
+        <w:t xml:space="preserve">section</w:t>
       </w:r>
       <w:r>
         <w:t xml:space="preserve"> </w:t>
@@ -5361,7 +5397,36 @@
         <w:t xml:space="preserve">text-claim analogue of nowcasting news decomposition with an explicit, scored revision gate on a numeric forecast</w:t>
       </w:r>
       <w:r>
-        <w:t xml:space="preserve">. It is not the first explainable forecast revision, because model-based nowcasting already attributes revisions to numeric news [28], [29]. Nor is it the first claim-level evidence log, because LLM agents already keep dated, provenance-annotated ledgers [41]. A recent real-time evaluation of LLM macro nowcasts [44] has not yet been read and must be checked.</w:t>
+        <w:t xml:space="preserve">. It is not the first explainable forecast revision, because model-based nowcasting already attributes revisions to numeric news [28], [29]. Nor is it the first claim-level evidence log, because LLM agents already keep dated, provenance-annotated ledgers [41]. A real-time evaluation of LLM macro nowcasts [44], now read in full, lets LLM agents revise US CPI nowcasts by their own judgement. It has no explicit update rule and no comparison of update policies, and the agents perform worst on inflation. An LLM-based CPI model with text-derived inputs and prediction intervals [45] also exists (China, social-media text), but it has no revision policy. News-driven updating of nowcasts is likewise established [30], [31]. Behavioural evidence that forecasters over- or under-react to news [46] motivates</w:t>
+      </w:r>
+      <w:r>
+        <w:t xml:space="preserve"> </w:t>
+      </w:r>
+      <w:r>
+        <w:rPr>
+          <w:bCs/>
+          <w:b/>
+        </w:rPr>
+        <w:t xml:space="preserve">bounded</w:t>
+      </w:r>
+      <w:r>
+        <w:t xml:space="preserve"> </w:t>
+      </w:r>
+      <w:r>
+        <w:t xml:space="preserve">rather than full revisions. Our gap is therefore narrowed to a</w:t>
+      </w:r>
+      <w:r>
+        <w:t xml:space="preserve"> </w:t>
+      </w:r>
+      <w:r>
+        <w:rPr>
+          <w:bCs/>
+          <w:b/>
+        </w:rPr>
+        <w:t xml:space="preserve">test-type contribution</w:t>
+      </w:r>
+      <w:r>
+        <w:t xml:space="preserve">: whether claim-level, source-linked evidence plus a pre-specified bounded revision rule adds value for Indian headline CPI y-o-y beyond strong numeric and simple text baselines.</w:t>
       </w:r>
     </w:p>
     <w:p>
@@ -6088,13 +6153,21 @@
       </w:r>
     </w:p>
     <w:bookmarkEnd w:id="36"/>
-    <w:bookmarkStart w:id="37" w:name="X805f9765af550725519170640183644c3b8a1a5"/>
+    <w:bookmarkStart w:id="37" w:name="vii-a.-dataset-assembled-october-2026"/>
     <w:p>
       <w:pPr>
         <w:pStyle w:val="Heading2"/>
       </w:pPr>
       <w:r>
-        <w:t xml:space="preserve">VIII. Limitations of This Review and Threats to Validity</w:t>
+        <w:t xml:space="preserve">VII-A. Dataset Assembled (October 2026)</w:t>
+      </w:r>
+    </w:p>
+    <w:p>
+      <w:pPr>
+        <w:pStyle w:val="FirstParagraph"/>
+      </w:pPr>
+      <w:r>
+        <w:t xml:space="preserve">A point-in-time dataset was assembled from official sources. Every item carries its publication time, and none is used before that time.</w:t>
       </w:r>
     </w:p>
     <w:p>
@@ -6106,7 +6179,17 @@
         <w:pStyle w:val="Compact"/>
       </w:pPr>
       <w:r>
-        <w:t xml:space="preserve">Only eight studies were read in full; the others were assessed from abstracts or summaries.</w:t>
+        <w:rPr>
+          <w:bCs/>
+          <w:b/>
+        </w:rPr>
+        <w:t xml:space="preserve">CPI history:</w:t>
+      </w:r>
+      <w:r>
+        <w:t xml:space="preserve"> </w:t>
+      </w:r>
+      <w:r>
+        <w:t xml:space="preserve">All-India CPI (Rural, Urban, Combined), base 2012=100 for Jan 2013 – Dec 2025 and base 2024=100 for Jan 2025 – Sep 2026 (613 rows), from the MoSPI e-Sankhyiki API. These are latest revised values, used for training only.</w:t>
       </w:r>
     </w:p>
     <w:p>
@@ -6118,7 +6201,17 @@
         <w:pStyle w:val="Compact"/>
       </w:pPr>
       <w:r>
-        <w:t xml:space="preserve">Search covered English-language sources, mainly IEEE Xplore and open web summaries, so Hindi and regional-language work and some journals may be missed.</w:t>
+        <w:rPr>
+          <w:bCs/>
+          <w:b/>
+        </w:rPr>
+        <w:t xml:space="preserve">CPI first releases:</w:t>
+      </w:r>
+      <w:r>
+        <w:t xml:space="preserve"> </w:t>
+      </w:r>
+      <w:r>
+        <w:t xml:space="preserve">33 monthly releases (Dec 2025; Jan 2024 – Aug 2026), with the actual release date and time, first-release value and link. Release dates shift when the 12th falls on a weekend (e.g., 13 Apr, 13 Jul, 14 Sep 2026), and values are revised later (Jan 2026: 2.75% first release, 2.74% later).</w:t>
       </w:r>
     </w:p>
     <w:p>
@@ -6130,7 +6223,17 @@
         <w:pStyle w:val="Compact"/>
       </w:pPr>
       <w:r>
-        <w:t xml:space="preserve">Published accuracy figures were not reproduced.</w:t>
+        <w:rPr>
+          <w:bCs/>
+          <w:b/>
+        </w:rPr>
+        <w:t xml:space="preserve">Evidence documents (81):</w:t>
+      </w:r>
+      <w:r>
+        <w:t xml:space="preserve"> </w:t>
+      </w:r>
+      <w:r>
+        <w:t xml:space="preserve">all 22 RBI MPC resolutions (Apr 2023 – Oct 2026), MPC minutes, 8 Monetary Policy Reports, the Economic Survey 2025-26, and 14 PIB releases on food and fuel prices and supply (wheat stock limits, onion buffer releases, pulses sales, edible-oil duties, a fuel excise cut, crop estimates).</w:t>
       </w:r>
     </w:p>
     <w:p>
@@ -6142,6 +6245,74 @@
         <w:pStyle w:val="Compact"/>
       </w:pPr>
       <w:r>
+        <w:rPr>
+          <w:bCs/>
+          <w:b/>
+        </w:rPr>
+        <w:t xml:space="preserve">Known breaks:</w:t>
+      </w:r>
+      <w:r>
+        <w:t xml:space="preserve"> </w:t>
+      </w:r>
+      <w:r>
+        <w:t xml:space="preserve">the CPI base change (Jan 2026; linking factor 0.5267); COVID-imputed CPI (Apr–May 2020); the WPI base change to 2022-23.</w:t>
+      </w:r>
+    </w:p>
+    <w:bookmarkEnd w:id="37"/>
+    <w:bookmarkStart w:id="38" w:name="X805f9765af550725519170640183644c3b8a1a5"/>
+    <w:p>
+      <w:pPr>
+        <w:pStyle w:val="Heading2"/>
+      </w:pPr>
+      <w:r>
+        <w:t xml:space="preserve">VIII. Limitations of This Review and Threats to Validity</w:t>
+      </w:r>
+    </w:p>
+    <w:p>
+      <w:pPr>
+        <w:numPr>
+          <w:ilvl w:val="0"/>
+          <w:numId w:val="1033"/>
+        </w:numPr>
+        <w:pStyle w:val="Compact"/>
+      </w:pPr>
+      <w:r>
+        <w:t xml:space="preserve">Only eight studies were read in full; the others were assessed from abstracts or summaries.</w:t>
+      </w:r>
+    </w:p>
+    <w:p>
+      <w:pPr>
+        <w:numPr>
+          <w:ilvl w:val="0"/>
+          <w:numId w:val="1033"/>
+        </w:numPr>
+        <w:pStyle w:val="Compact"/>
+      </w:pPr>
+      <w:r>
+        <w:t xml:space="preserve">Search covered English-language sources, mainly IEEE Xplore and open web summaries, so Hindi and regional-language work and some journals may be missed.</w:t>
+      </w:r>
+    </w:p>
+    <w:p>
+      <w:pPr>
+        <w:numPr>
+          <w:ilvl w:val="0"/>
+          <w:numId w:val="1033"/>
+        </w:numPr>
+        <w:pStyle w:val="Compact"/>
+      </w:pPr>
+      <w:r>
+        <w:t xml:space="preserve">Published accuracy figures were not reproduced.</w:t>
+      </w:r>
+    </w:p>
+    <w:p>
+      <w:pPr>
+        <w:numPr>
+          <w:ilvl w:val="0"/>
+          <w:numId w:val="1033"/>
+        </w:numPr>
+        <w:pStyle w:val="Compact"/>
+      </w:pPr>
+      <w:r>
         <w:t xml:space="preserve">Claim extraction by LLMs may itself carry look-ahead bias; this will be tested, not assumed away.</w:t>
       </w:r>
     </w:p>
@@ -6149,7 +6320,7 @@
       <w:pPr>
         <w:numPr>
           <w:ilvl w:val="0"/>
-          <w:numId w:val="1032"/>
+          <w:numId w:val="1033"/>
         </w:numPr>
         <w:pStyle w:val="Compact"/>
       </w:pPr>
@@ -6164,8 +6335,8 @@
         </w:pict>
       </w:r>
     </w:p>
-    <w:bookmarkEnd w:id="37"/>
-    <w:bookmarkStart w:id="38" w:name="ix.-conclusion"/>
+    <w:bookmarkEnd w:id="38"/>
+    <w:bookmarkStart w:id="39" w:name="ix.-conclusion"/>
     <w:p>
       <w:pPr>
         <w:pStyle w:val="Heading2"/>
@@ -6189,8 +6360,8 @@
         </w:pict>
       </w:r>
     </w:p>
-    <w:bookmarkEnd w:id="38"/>
-    <w:bookmarkStart w:id="39" w:name="references"/>
+    <w:bookmarkEnd w:id="39"/>
+    <w:bookmarkStart w:id="40" w:name="references"/>
     <w:p>
       <w:pPr>
         <w:pStyle w:val="Heading2"/>
@@ -7657,7 +7828,7 @@
         <w:t xml:space="preserve"> </w:t>
       </w:r>
       <w:r>
-        <w:t xml:space="preserve">arXiv:2608.30110, 2026. [cited via [41]; not read]</w:t>
+        <w:t xml:space="preserve">arXiv:2608.30110v1, 2026.</w:t>
       </w:r>
     </w:p>
     <w:p>
@@ -7665,6 +7836,65 @@
         <w:pStyle w:val="BodyText"/>
       </w:pPr>
       <w:r>
+        <w:t xml:space="preserve">[45] Y. Fan, J. Lv, A. Sun and Y. Wang,</w:t>
+      </w:r>
+      <w:r>
+        <w:t xml:space="preserve"> </w:t>
+      </w:r>
+      <w:r>
+        <w:t xml:space="preserve">“</w:t>
+      </w:r>
+      <w:r>
+        <w:t xml:space="preserve">LLM-powered CPI prediction inference with online text time series,</w:t>
+      </w:r>
+      <w:r>
+        <w:t xml:space="preserve">”</w:t>
+      </w:r>
+      <w:r>
+        <w:t xml:space="preserve"> </w:t>
+      </w:r>
+      <w:r>
+        <w:t xml:space="preserve">arXiv:2506.09516v1, 2025.</w:t>
+      </w:r>
+    </w:p>
+    <w:p>
+      <w:pPr>
+        <w:pStyle w:val="BodyText"/>
+      </w:pPr>
+      <w:r>
+        <w:t xml:space="preserve">[46] P. Bordalo, N. Gennaioli, Y. Ma and A. Shleifer,</w:t>
+      </w:r>
+      <w:r>
+        <w:t xml:space="preserve"> </w:t>
+      </w:r>
+      <w:r>
+        <w:t xml:space="preserve">“</w:t>
+      </w:r>
+      <w:r>
+        <w:t xml:space="preserve">Overreaction in macroeconomic expectations,</w:t>
+      </w:r>
+      <w:r>
+        <w:t xml:space="preserve">”</w:t>
+      </w:r>
+      <w:r>
+        <w:t xml:space="preserve"> </w:t>
+      </w:r>
+      <w:r>
+        <w:rPr>
+          <w:iCs/>
+          <w:i/>
+        </w:rPr>
+        <w:t xml:space="preserve">American Economic Review</w:t>
+      </w:r>
+      <w:r>
+        <w:t xml:space="preserve">, vol. 110, no. 9, pp. 2748–2782, 2020. [A]</w:t>
+      </w:r>
+    </w:p>
+    <w:p>
+      <w:pPr>
+        <w:pStyle w:val="BodyText"/>
+      </w:pPr>
+      <w:r>
         <w:t xml:space="preserve">[45] J. John, S. Singh and M. Kapur,</w:t>
       </w:r>
       <w:r>
@@ -7686,7 +7916,7 @@
         <w:t xml:space="preserve">RBI Working Paper No. 11, 2020. [cited via [6]; not read]</w:t>
       </w:r>
     </w:p>
-    <w:bookmarkEnd w:id="39"/>
+    <w:bookmarkEnd w:id="40"/>
     <w:sectPr/>
   </w:body>
 </w:document>
@@ -8607,6 +8837,9 @@
     <w:abstractNumId w:val="991"/>
   </w:num>
   <w:num w:numId="1032">
+    <w:abstractNumId w:val="991"/>
+  </w:num>
+  <w:num w:numId="1033">
     <w:abstractNumId w:val="99411"/>
     <w:lvlOverride w:ilvl="0">
       <w:startOverride w:val="1"/>

</xml_diff>